<commit_message>
docs(requisitos): RN09 e ressalva da RN08 nos documentos de requisitos e na matriz
- RN09: bloqueio por tentativas de acesso (#230).
- RN08: média por garçom no índice só com 5+ avaliações no período (#232).
- Ficha de números: 9 regras de negócio e motivo do RF12 já registrado.

Refs #230 #232
</commit_message>
<xml_diff>
--- a/docs/requisitos/GASTRA_Matriz_Rastreabilidade.docx
+++ b/docs/requisitos/GASTRA_Matriz_Rastreabilidade.docx
@@ -6517,7 +6517,7 @@
                 <w:sz w:val="18"/>
                 <w:szCs w:val="18"/>
               </w:rPr>
-              <w:t xml:space="preserve">A avaliação do atendimento é anônima e não guarda identificador de quem avaliou; cada comanda aceita uma única avaliação, só depois do fechamento e dentro de 24 horas; o Gerente vê apenas números agregados.</w:t>
+              <w:t xml:space="preserve">A avaliação do atendimento é anônima e não guarda identificador de quem avaliou; cada comanda aceita uma única avaliação, só depois do fechamento e dentro de 24 horas; o Gerente vê apenas números agregados. No índice de desempenho (RF11), a média por garçom só é usada e exibida com pelo menos 5 avaliações no período; abaixo disso, o garçom recebe a média geral.</w:t>
             </w:r>
           </w:p>
         </w:tc>
@@ -6571,7 +6571,185 @@
                 <w:sz w:val="18"/>
                 <w:szCs w:val="18"/>
               </w:rPr>
-              <w:t xml:space="preserve">RF25; RNF03</w:t>
+              <w:t xml:space="preserve">RF25; RF11; RNF03</w:t>
+            </w:r>
+            <w:r>
+              <w:rPr>
+                <w:sz w:val="18"/>
+                <w:szCs w:val="18"/>
+              </w:rPr>
+              <w:t/>
+            </w:r>
+          </w:p>
+        </w:tc>
+        <w:tc>
+          <w:tcPr>
+            <w:tcW w:w="2528" w:type="dxa"/>
+            <w:tcMar>
+              <w:top w:w="60" w:type="dxa"/>
+              <w:left w:w="100" w:type="dxa"/>
+              <w:bottom w:w="60" w:type="dxa"/>
+              <w:right w:w="100" w:type="dxa"/>
+            </w:tcMar>
+            <w:vAlign w:val="center"/>
+          </w:tcPr>
+          <w:p>
+            <w:pPr>
+              <w:rPr>
+                <w:sz w:val="18"/>
+                <w:szCs w:val="18"/>
+              </w:rPr>
+            </w:pPr>
+            <w:r>
+              <w:rPr>
+                <w:sz w:val="18"/>
+                <w:szCs w:val="18"/>
+              </w:rPr>
+              <w:t xml:space="preserve">Decisão interna + teste automatizado</w:t>
+            </w:r>
+          </w:p>
+        </w:tc>
+        <w:tc>
+          <w:tcPr>
+            <w:tcW w:w="1984" w:type="dxa"/>
+            <w:shd w:val="clear" w:color="auto" w:fill="E2EFDA"/>
+            <w:tcMar>
+              <w:top w:w="60" w:type="dxa"/>
+              <w:left w:w="100" w:type="dxa"/>
+              <w:bottom w:w="60" w:type="dxa"/>
+              <w:right w:w="100" w:type="dxa"/>
+            </w:tcMar>
+            <w:vAlign w:val="center"/>
+          </w:tcPr>
+          <w:p>
+            <w:pPr>
+              <w:jc w:val="center"/>
+              <w:rPr>
+                <w:sz w:val="18"/>
+                <w:szCs w:val="18"/>
+              </w:rPr>
+            </w:pPr>
+            <w:r>
+              <w:rPr>
+                <w:sz w:val="18"/>
+                <w:szCs w:val="18"/>
+              </w:rPr>
+              <w:t xml:space="preserve">Aprovado</w:t>
+            </w:r>
+          </w:p>
+        </w:tc>
+      </w:tr>
+      <w:tr>
+        <w:tc>
+          <w:tcPr>
+            <w:tcW w:w="1000" w:type="dxa"/>
+            <w:tcMar>
+              <w:top w:w="60" w:type="dxa"/>
+              <w:left w:w="100" w:type="dxa"/>
+              <w:bottom w:w="60" w:type="dxa"/>
+              <w:right w:w="100" w:type="dxa"/>
+            </w:tcMar>
+            <w:vAlign w:val="center"/>
+          </w:tcPr>
+          <w:p>
+            <w:pPr>
+              <w:jc w:val="center"/>
+              <w:rPr>
+                <w:b/>
+                <w:bCs/>
+                <w:sz w:val="18"/>
+                <w:szCs w:val="18"/>
+              </w:rPr>
+            </w:pPr>
+            <w:r>
+              <w:rPr>
+                <w:b/>
+                <w:bCs/>
+                <w:sz w:val="18"/>
+                <w:szCs w:val="18"/>
+              </w:rPr>
+              <w:t xml:space="preserve">RN09</w:t>
+            </w:r>
+          </w:p>
+        </w:tc>
+        <w:tc>
+          <w:tcPr>
+            <w:tcW w:w="4300" w:type="dxa"/>
+            <w:tcMar>
+              <w:top w:w="60" w:type="dxa"/>
+              <w:left w:w="100" w:type="dxa"/>
+              <w:bottom w:w="60" w:type="dxa"/>
+              <w:right w:w="100" w:type="dxa"/>
+            </w:tcMar>
+            <w:vAlign w:val="center"/>
+          </w:tcPr>
+          <w:p>
+            <w:pPr>
+              <w:rPr>
+                <w:sz w:val="18"/>
+                <w:szCs w:val="18"/>
+              </w:rPr>
+            </w:pPr>
+            <w:r>
+              <w:rPr>
+                <w:sz w:val="18"/>
+                <w:szCs w:val="18"/>
+              </w:rPr>
+              <w:t xml:space="preserve">Cinco tentativas de acesso erradas seguidas — de senha ou do código do segundo fator — bloqueiam a conta por 15 minutos, e só um acesso completo zera a contagem. Durante o bloqueio, o login responde a mesma mensagem da senha errada, para não revelar quais e-mails estão cadastrados.</w:t>
+            </w:r>
+          </w:p>
+        </w:tc>
+        <w:tc>
+          <w:tcPr>
+            <w:tcW w:w="2400" w:type="dxa"/>
+            <w:tcMar>
+              <w:top w:w="60" w:type="dxa"/>
+              <w:left w:w="100" w:type="dxa"/>
+              <w:bottom w:w="60" w:type="dxa"/>
+              <w:right w:w="100" w:type="dxa"/>
+            </w:tcMar>
+            <w:vAlign w:val="center"/>
+          </w:tcPr>
+          <w:p>
+            <w:pPr>
+              <w:rPr>
+                <w:sz w:val="18"/>
+                <w:szCs w:val="18"/>
+              </w:rPr>
+            </w:pPr>
+            <w:r>
+              <w:rPr>
+                <w:sz w:val="18"/>
+                <w:szCs w:val="18"/>
+              </w:rPr>
+              <w:t xml:space="preserve">Decisão da dupla (23/09) — issue #230</w:t>
+            </w:r>
+          </w:p>
+        </w:tc>
+        <w:tc>
+          <w:tcPr>
+            <w:tcW w:w="2100" w:type="dxa"/>
+            <w:tcMar>
+              <w:top w:w="60" w:type="dxa"/>
+              <w:left w:w="100" w:type="dxa"/>
+              <w:bottom w:w="60" w:type="dxa"/>
+              <w:right w:w="100" w:type="dxa"/>
+            </w:tcMar>
+            <w:vAlign w:val="center"/>
+          </w:tcPr>
+          <w:p>
+            <w:pPr>
+              <w:rPr>
+                <w:sz w:val="18"/>
+                <w:szCs w:val="18"/>
+              </w:rPr>
+            </w:pPr>
+            <w:r>
+              <w:rPr>
+                <w:sz w:val="18"/>
+                <w:szCs w:val="18"/>
+              </w:rPr>
+              <w:t xml:space="preserve">UC01; UC02; RN06; RN07</w:t>
             </w:r>
             <w:r>
               <w:rPr>

</xml_diff>